<commit_message>
feat: completar Laboratorio 4 ML y GIS Parte 2
Finaliza el laboratorio conforme a la rúbrica: incorpora validación espacial y temporal, transferencia entre lagos, análisis SHAP, mapas predictivos y cartografía de errores FP/FN. Actualiza el notebook ejecutado, informe final LaTeX/PDF, ficha del repositorio DOCX/PDF, README, dependencias, pruebas y resultados reproducibles. Retira los archivos correspondientes al avance del 75%.
</commit_message>
<xml_diff>
--- a/reports/Presentacion_Repositorio_Laboratorio_4_ML_GIS_Grupo_1.docx
+++ b/reports/Presentacion_Repositorio_Laboratorio_4_ML_GIS_Grupo_1.docx
@@ -131,7 +131,7 @@
                 <w:color w:val="0F766E"/>
                 <w:sz w:val="20"/>
               </w:rPr>
-              <w:t>PRESENTACIÓN DEL REPOSITORIO  ·  AVANCE 75%</w:t>
+              <w:t>PRESENTACIÓN DEL REPOSITORIO  ·  ENTREGA FINAL 100%</w:t>
             </w:r>
           </w:p>
         </w:tc>
@@ -695,7 +695,7 @@
                 <w:color w:val="243B53"/>
                 <w:sz w:val="20"/>
               </w:rPr>
-              <w:t>Avance reproducible del 75%</w:t>
+              <w:t>Entrega final completa y reproducible</w:t>
             </w:r>
           </w:p>
         </w:tc>
@@ -2056,6 +2056,72 @@
           </w:p>
         </w:tc>
       </w:tr>
+      <w:tr>
+        <w:tc>
+          <w:tcPr>
+            <w:tcW w:type="dxa" w:w="2541"/>
+          </w:tcPr>
+          <w:p>
+            <w:r>
+              <w:rPr>
+                <w:rFonts w:ascii="Aptos" w:hAnsi="Aptos" w:eastAsia="Aptos"/>
+                <w:b w:val="0"/>
+                <w:color w:val="243B53"/>
+                <w:sz w:val="18"/>
+              </w:rPr>
+              <w:t>Mapa final</w:t>
+            </w:r>
+          </w:p>
+        </w:tc>
+        <w:tc>
+          <w:tcPr>
+            <w:tcW w:type="dxa" w:w="2541"/>
+          </w:tcPr>
+          <w:p>
+            <w:r>
+              <w:rPr>
+                <w:rFonts w:ascii="Aptos" w:hAnsi="Aptos" w:eastAsia="Aptos"/>
+                <w:b w:val="0"/>
+                <w:color w:val="243B53"/>
+                <w:sz w:val="18"/>
+              </w:rPr>
+              <w:t>Amatitlán</w:t>
+            </w:r>
+          </w:p>
+        </w:tc>
+        <w:tc>
+          <w:tcPr>
+            <w:tcW w:type="dxa" w:w="2541"/>
+          </w:tcPr>
+          <w:p>
+            <w:r>
+              <w:rPr>
+                <w:rFonts w:ascii="Aptos" w:hAnsi="Aptos" w:eastAsia="Aptos"/>
+                <w:b w:val="0"/>
+                <w:color w:val="243B53"/>
+                <w:sz w:val="18"/>
+              </w:rPr>
+              <w:t>Riesgo alto</w:t>
+            </w:r>
+          </w:p>
+        </w:tc>
+        <w:tc>
+          <w:tcPr>
+            <w:tcW w:type="dxa" w:w="2541"/>
+          </w:tcPr>
+          <w:p>
+            <w:r>
+              <w:rPr>
+                <w:rFonts w:ascii="Aptos" w:hAnsi="Aptos" w:eastAsia="Aptos"/>
+                <w:b w:val="0"/>
+                <w:color w:val="243B53"/>
+                <w:sz w:val="18"/>
+              </w:rPr>
+              <w:t>59.58%</w:t>
+            </w:r>
+          </w:p>
+        </w:tc>
+      </w:tr>
     </w:tbl>
     <w:p>
       <w:pPr>
@@ -2595,7 +2661,55 @@
                 <w:color w:val="243B53"/>
                 <w:sz w:val="19"/>
               </w:rPr>
-              <w:t>Métricas, matrices de confusión, figuras espaciales e importancia global.</w:t>
+              <w:t>Métricas, matrices de confusión y validaciones espacial, temporal y cruzada.</w:t>
+            </w:r>
+          </w:p>
+        </w:tc>
+      </w:tr>
+      <w:tr>
+        <w:tc>
+          <w:tcPr>
+            <w:tcW w:type="dxa" w:w="5083"/>
+            <w:shd w:fill="E7F7F5"/>
+            <w:tcMar>
+              <w:top w:w="95" w:type="dxa"/>
+              <w:start w:w="140" w:type="dxa"/>
+              <w:bottom w:w="95" w:type="dxa"/>
+              <w:end w:w="140" w:type="dxa"/>
+            </w:tcMar>
+          </w:tcPr>
+          <w:p>
+            <w:r>
+              <w:rPr>
+                <w:rFonts w:ascii="Aptos" w:hAnsi="Aptos" w:eastAsia="Aptos"/>
+                <w:b/>
+                <w:color w:val="0F9D91"/>
+                <w:sz w:val="17"/>
+              </w:rPr>
+              <w:t>INTERPRETACIÓN</w:t>
+            </w:r>
+          </w:p>
+        </w:tc>
+        <w:tc>
+          <w:tcPr>
+            <w:tcW w:type="dxa" w:w="5083"/>
+            <w:shd w:fill="FFFFFF"/>
+            <w:tcMar>
+              <w:top w:w="95" w:type="dxa"/>
+              <w:start w:w="140" w:type="dxa"/>
+              <w:bottom w:w="95" w:type="dxa"/>
+              <w:end w:w="140" w:type="dxa"/>
+            </w:tcMar>
+          </w:tcPr>
+          <w:p>
+            <w:r>
+              <w:rPr>
+                <w:rFonts w:ascii="Aptos" w:hAnsi="Aptos" w:eastAsia="Aptos"/>
+                <w:b w:val="0"/>
+                <w:color w:val="243B53"/>
+                <w:sz w:val="19"/>
+              </w:rPr>
+              <w:t>SHAP global/local, mapas de riesgo y cartografía de falsos resultados.</w:t>
             </w:r>
           </w:p>
         </w:tc>
@@ -2737,7 +2851,7 @@
                 <w:color w:val="FFFFFF"/>
                 <w:sz w:val="16"/>
               </w:rPr>
-              <w:t>uv run python scripts/run_ml_advance.py</w:t>
+              <w:t>uv run python scripts/run_ml_final.py</w:t>
             </w:r>
             <w:r>
               <w:br/>
@@ -2766,7 +2880,7 @@
           <w:color w:val="D97706"/>
           <w:sz w:val="18"/>
         </w:rPr>
-        <w:t xml:space="preserve">Nota de entrega: </w:t>
+        <w:t xml:space="preserve">Nota de datos: </w:t>
       </w:r>
       <w:r>
         <w:rPr>
@@ -2775,7 +2889,7 @@
           <w:color w:val="486581"/>
           <w:sz w:val="18"/>
         </w:rPr>
-        <w:t>antes de compartir este documento, debe comprobarse que la versión local más reciente haya sido confirmada y sincronizada con GitHub. Los GeoTIFF y datasets grandes permanecen fuera de Git por diseño y se reconstruyen mediante los scripts.</w:t>
+        <w:t>los 22 GeoTIFF, datasets, modelos y mapas raster grandes permanecen fuera de Git por diseño. Las instrucciones y scripts incluidos permiten reconstruirlos sin almacenar credenciales.</w:t>
       </w:r>
     </w:p>
     <w:p/>

</xml_diff>

<commit_message>
fix: sincronizar mapas fuera de muestra y entregables finales
Regenera los mapas predictivos excluyendo la fecha evaluada del entrenamiento y elimina los resultados obsoletos. Actualiza métricas poblacionales, SHAP, tablas, figuras, notebook ejecutado, informe LaTeX/PDF, README y ficha del repositorio. Verifica 10 pruebas automatizadas, coherencia documental y ausencia de credenciales.
</commit_message>
<xml_diff>
--- a/reports/Presentacion_Repositorio_Laboratorio_4_ML_GIS_Grupo_1.docx
+++ b/reports/Presentacion_Repositorio_Laboratorio_4_ML_GIS_Grupo_1.docx
@@ -1583,6 +1583,36 @@
         <w:t>Métricas: accuracy, precision, recall, F1, ROC-AUC y matrices de confusión.</w:t>
       </w:r>
     </w:p>
+    <w:p>
+      <w:pPr>
+        <w:pStyle w:val="ListBullet"/>
+        <w:spacing w:after="60"/>
+      </w:pPr>
+      <w:r>
+        <w:rPr>
+          <w:rFonts w:ascii="Aptos" w:hAnsi="Aptos" w:eastAsia="Aptos"/>
+          <w:b w:val="0"/>
+          <w:color w:val="243B53"/>
+          <w:sz w:val="20"/>
+        </w:rPr>
+        <w:t>Cartografía: cada última escena se predice con un modelo reentrenado sin esa fecha.</w:t>
+      </w:r>
+    </w:p>
+    <w:p>
+      <w:pPr>
+        <w:pStyle w:val="ListBullet"/>
+        <w:spacing w:after="60"/>
+      </w:pPr>
+      <w:r>
+        <w:rPr>
+          <w:rFonts w:ascii="Aptos" w:hAnsi="Aptos" w:eastAsia="Aptos"/>
+          <w:b w:val="0"/>
+          <w:color w:val="243B53"/>
+          <w:sz w:val="20"/>
+        </w:rPr>
+        <w:t>Escala poblacional: tasas fuera de muestra reponderadas sobre 3.42 millones de píxeles válidos.</w:t>
+      </w:r>
+    </w:p>
     <w:tbl>
       <w:tblPr>
         <w:tblW w:type="auto" w:w="0"/>
@@ -2069,7 +2099,7 @@
                 <w:color w:val="243B53"/>
                 <w:sz w:val="18"/>
               </w:rPr>
-              <w:t>Mapa final</w:t>
+              <w:t>Mapa fuera de muestra</w:t>
             </w:r>
           </w:p>
         </w:tc>
@@ -2117,7 +2147,7 @@
                 <w:color w:val="243B53"/>
                 <w:sz w:val="18"/>
               </w:rPr>
-              <w:t>59.58%</w:t>
+              <w:t>18.60%</w:t>
             </w:r>
           </w:p>
         </w:tc>
@@ -2134,7 +2164,7 @@
           <w:color w:val="486581"/>
           <w:sz w:val="20"/>
         </w:rPr>
-        <w:t>La diferencia entre los resultados aleatorios y temporales evidencia que la capacidad predictiva debe evaluarse bajo cambios de fecha y territorio. Desde vigilancia ambiental, el recall es especialmente relevante porque un falso negativo puede omitir una zona potencialmente problemática.</w:t>
+        <w:t>La diferencia entre resultados aleatorios y temporales evidencia cambio de distribución. En la última escena de Amatitlán el modelo fuera de muestra marca 18.60% de riesgo alto frente a 53.6% observado y alcanza recall 0.5611. Reponderando a toda la población, la precision global esperada es 0.9203 y el recall 0.9783.</w:t>
       </w:r>
     </w:p>
     <w:p>

</xml_diff>